<commit_message>
Paper 1 v3 PCCP submission package — round-2 audit patches applied (figure dimensions, manuscript wording, abstract trim, cover letter Zenodo language). See PCCP_SUBMISSION_CHECKLIST.md for full patch list.
</commit_message>
<xml_diff>
--- a/Paper1_PCCP_submission.docx
+++ b/Paper1_PCCP_submission.docx
@@ -99,7 +99,7 @@
           <w:sz w:val="22"/>
           <w:szCs w:val="22"/>
         </w:rPr>
-        <w:t xml:space="preserve">Radical-pair magnetoreception converts orientation-dependent spin dynamics into reaction-yield anisotropy, providing a working biological example of how transient quantum dynamics produce classical readouts. Computational claims about such systems can drift from the underlying numerical implementation if methods, code, and observables are not aligned. We present a claim-aligned reduced radical-pair model with axial hyperfine coupling, geomagnetic-scale field, orientation sampling on a Fibonacci sphere, infinite-time Liouvillian yield computation, and validated yield closure. Isotropic-hyperfine controls give machine-zero anisotropy; the axial coupling produces nonzero orientation-dependent response. The baseline ratio scan exhibits a broad response peak in recombination-ratio space near </w:t>
+        <w:t xml:space="preserve">Radical-pair magnetoreception converts orientation-dependent spin dynamics into reaction-yield anisotropy, providing a worked biological example of how transient quantum dynamics produce classical readouts. Computational claims about such systems can drift from the underlying numerical implementation if methods, code, and observables are not aligned. We present a claim-aligned reduced radical-pair model with axial hyperfine coupling, geomagnetic-scale field, Fibonacci-sphere orientation sampling, and validated infinite-time Liouvillian yield computation. Isotropic-hyperfine controls give machine-zero anisotropy; the axial coupling produces a nonzero orientation-dependent response with a broad peak in recombination-ratio space near </w:t>
       </w:r>
       <w:r>
         <w:rPr>
@@ -117,7 +117,7 @@
           <w:sz w:val="22"/>
           <w:szCs w:val="22"/>
         </w:rPr>
-        <w:t xml:space="preserve"> = −0.3 with FWHM ≈ 1.2 decades. The response is ratio-organized but not invariant to absolute kinetic scale: amplitude varies by orders of magnitude across the tested λ range, and peak location shifts. In the tested implementation, Haberkorn trace-loss dynamics and the absorbing-product effective yield formulation produce identical results — a consistency check rather than a broad statement of formalism independence, since the implemented absorbing-product channel reduces to the Haberkorn equation for the radical-pair sector. </w:t>
+        <w:t xml:space="preserve"> = −0.3 (FWHM ≈ 1.2 decades). The response is ratio-organized but not invariant to absolute kinetic scale: amplitude varies by orders of magnitude across the tested λ range, and peak location shifts. Haberkorn trace-loss dynamics and the absorbing-product effective yield formulation produce identical results in the radical-pair sector — a consistency check rather than a broad statement of formalism independence. </w:t>
       </w:r>
       <w:r>
         <w:rPr>
@@ -135,7 +135,7 @@
           <w:sz w:val="22"/>
           <w:szCs w:val="22"/>
         </w:rPr>
-        <w:t xml:space="preserve">-dephasing on both electron spins enhances the response within a finite window (γ_opt ≈ 3, factor ≈ 2× peak); single-electron spin-flip relaxation has its maximum at zero relaxation and suppresses the response over the tested range, with no enhancement window. The slowest-decay-rate spectral proxy of the Liouvillian correlates strongly with the anisotropy curve (Pearson </w:t>
+        <w:t xml:space="preserve">-dephasing on both electron spins enhances the response within a finite window (γ_opt ≈ 3, factor ≈ 2× peak); single-electron spin-flip relaxation has its maximum at zero relaxation and suppresses the response over the tested range, with no enhancement window. The slowest-decay-rate Liouvillian spectral proxy correlates strongly with the anisotropy curve (Pearson </w:t>
       </w:r>
       <w:r>
         <w:rPr>
@@ -153,7 +153,7 @@
           <w:sz w:val="22"/>
           <w:szCs w:val="22"/>
         </w:rPr>
-        <w:t xml:space="preserve"> ≈ 0.91). All numerical claims are supported by a public reproducibility archive containing the v3 code, raw outputs, figure data, and SHA256 manifests. The results document a reproducible reduced-model mechanism for ratio-dependent response structure in radical-pair magnetoreception while highlighting limits to broad robustness claims.</w:t>
+        <w:t xml:space="preserve"> ≈ 0.91). All numerical claims are supported by a public reproducibility archive containing the v3 code, raw outputs, figure data, and SHA256 manifests. The results document a reproducible reduced-model mechanism for ratio-dependent response structure in radical-pair magnetoreception while bounding broad robustness claims.</w:t>
       </w:r>
     </w:p>
     <w:p>
@@ -249,7 +249,7 @@
           <w:sz w:val="22"/>
           <w:szCs w:val="22"/>
         </w:rPr>
-        <w:t xml:space="preserve">A claim-versus-code audit of an earlier implementation revealed multiple mismatches between the manuscript text and the actual numerical computations. The present v3 implementation was rebuilt to address these mismatches, with explicit hyperfine tensor structure (axial, </w:t>
+        <w:t xml:space="preserve">A claim-versus-code audit of an earlier implementation revealed multiple mismatches between the manuscript text and the actual numerical computations. The present v3 implementation was rebuilt to address these mismatches, with an explicit axial hyperfine tensor </w:t>
       </w:r>
       <w:r>
         <w:rPr>
@@ -267,7 +267,7 @@
           <w:sz w:val="22"/>
           <w:szCs w:val="22"/>
         </w:rPr>
-        <w:t xml:space="preserve">∥ = 1.0 </w:t>
+        <w:t xml:space="preserve"> = diag(</w:t>
       </w:r>
       <w:r>
         <w:rPr>
@@ -285,7 +285,79 @@
           <w:sz w:val="22"/>
           <w:szCs w:val="22"/>
         </w:rPr>
-        <w:t xml:space="preserve">⊥), geomagnetic-scale field (</w:t>
+        <w:t xml:space="preserve">⊥, </w:t>
+      </w:r>
+      <w:r>
+        <w:rPr>
+          <w:rFonts w:ascii="Times New Roman" w:cs="Times New Roman" w:eastAsia="Times New Roman" w:hAnsi="Times New Roman"/>
+          <w:i/>
+          <w:iCs/>
+          <w:sz w:val="22"/>
+          <w:szCs w:val="22"/>
+        </w:rPr>
+        <w:t xml:space="preserve">A</w:t>
+      </w:r>
+      <w:r>
+        <w:rPr>
+          <w:rFonts w:ascii="Times New Roman" w:cs="Times New Roman" w:eastAsia="Times New Roman" w:hAnsi="Times New Roman"/>
+          <w:sz w:val="22"/>
+          <w:szCs w:val="22"/>
+        </w:rPr>
+        <w:t xml:space="preserve">⊥, </w:t>
+      </w:r>
+      <w:r>
+        <w:rPr>
+          <w:rFonts w:ascii="Times New Roman" w:cs="Times New Roman" w:eastAsia="Times New Roman" w:hAnsi="Times New Roman"/>
+          <w:i/>
+          <w:iCs/>
+          <w:sz w:val="22"/>
+          <w:szCs w:val="22"/>
+        </w:rPr>
+        <w:t xml:space="preserve">A</w:t>
+      </w:r>
+      <w:r>
+        <w:rPr>
+          <w:rFonts w:ascii="Times New Roman" w:cs="Times New Roman" w:eastAsia="Times New Roman" w:hAnsi="Times New Roman"/>
+          <w:sz w:val="22"/>
+          <w:szCs w:val="22"/>
+        </w:rPr>
+        <w:t xml:space="preserve">∥), with </w:t>
+      </w:r>
+      <w:r>
+        <w:rPr>
+          <w:rFonts w:ascii="Times New Roman" w:cs="Times New Roman" w:eastAsia="Times New Roman" w:hAnsi="Times New Roman"/>
+          <w:i/>
+          <w:iCs/>
+          <w:sz w:val="22"/>
+          <w:szCs w:val="22"/>
+        </w:rPr>
+        <w:t xml:space="preserve">A</w:t>
+      </w:r>
+      <w:r>
+        <w:rPr>
+          <w:rFonts w:ascii="Times New Roman" w:cs="Times New Roman" w:eastAsia="Times New Roman" w:hAnsi="Times New Roman"/>
+          <w:sz w:val="22"/>
+          <w:szCs w:val="22"/>
+        </w:rPr>
+        <w:t xml:space="preserve">∥ = 1.0 and </w:t>
+      </w:r>
+      <w:r>
+        <w:rPr>
+          <w:rFonts w:ascii="Times New Roman" w:cs="Times New Roman" w:eastAsia="Times New Roman" w:hAnsi="Times New Roman"/>
+          <w:i/>
+          <w:iCs/>
+          <w:sz w:val="22"/>
+          <w:szCs w:val="22"/>
+        </w:rPr>
+        <w:t xml:space="preserve">A</w:t>
+      </w:r>
+      <w:r>
+        <w:rPr>
+          <w:rFonts w:ascii="Times New Roman" w:cs="Times New Roman" w:eastAsia="Times New Roman" w:hAnsi="Times New Roman"/>
+          <w:sz w:val="22"/>
+          <w:szCs w:val="22"/>
+        </w:rPr>
+        <w:t xml:space="preserve">⊥ = 0.5; geomagnetic-scale field (</w:t>
       </w:r>
       <w:r>
         <w:rPr>
@@ -321,7 +393,7 @@
           <w:sz w:val="22"/>
           <w:szCs w:val="22"/>
         </w:rPr>
-        <w:t xml:space="preserve">∥ ≈ 1 mT), Fibonacci-sphere orientation sampling, and infinite-time Liouvillian yield computation with finite-time spot-check validation. Pre-flight calibration tests confirm yield closure at numerical precision and reproduce v2 isotropic limits in legacy mode. The resulting pipeline is the basis for the claims made below.</w:t>
+        <w:t xml:space="preserve">∥ ≈ 1 mT); Fibonacci-sphere orientation sampling; and infinite-time Liouvillian yield computation with finite-time spot-check validation. Pre-flight calibration tests confirm yield closure at numerical precision and reproduce v2 isotropic limits in legacy mode. The resulting pipeline is the basis for the claims made below.</w:t>
       </w:r>
     </w:p>
     <w:p>
@@ -2633,25 +2705,7 @@
           <w:sz w:val="22"/>
           <w:szCs w:val="22"/>
         </w:rPr>
-        <w:t xml:space="preserve">First, the </w:t>
-      </w:r>
-      <w:r>
-        <w:rPr>
-          <w:rFonts w:ascii="Times New Roman" w:cs="Times New Roman" w:eastAsia="Times New Roman" w:hAnsi="Times New Roman"/>
-          <w:i/>
-          <w:iCs/>
-          <w:sz w:val="22"/>
-          <w:szCs w:val="22"/>
-        </w:rPr>
-        <w:t xml:space="preserve">form</w:t>
-      </w:r>
-      <w:r>
-        <w:rPr>
-          <w:rFonts w:ascii="Times New Roman" w:cs="Times New Roman" w:eastAsia="Times New Roman" w:hAnsi="Times New Roman"/>
-          <w:sz w:val="22"/>
-          <w:szCs w:val="22"/>
-        </w:rPr>
-        <w:t xml:space="preserve"> of α(</w:t>
+        <w:t xml:space="preserve">First, a peak with similar FWHM appears at each λ, but the normalized shape is not preserved at slow absolute rates: at λ = 0.1 the peak shifts to </w:t>
       </w:r>
       <w:r>
         <w:rPr>
@@ -2669,7 +2723,15 @@
           <w:sz w:val="22"/>
           <w:szCs w:val="22"/>
         </w:rPr>
-        <w:t xml:space="preserve">) is preserved across λ: a peak with comparable FWHM appears at each λ. This supports the notion that the response is organized in ratio space.</w:t>
+        <w:t xml:space="preserve">*</w:t>
+      </w:r>
+      <w:r>
+        <w:rPr>
+          <w:rFonts w:ascii="Times New Roman" w:cs="Times New Roman" w:eastAsia="Times New Roman" w:hAnsi="Times New Roman"/>
+          <w:sz w:val="22"/>
+          <w:szCs w:val="22"/>
+        </w:rPr>
+        <w:t xml:space="preserve"> ≈ +0.5, and the normalized RMS deviation between the λ = 0.1 and λ = 1 curves is approximately 0.43.</w:t>
       </w:r>
     </w:p>
     <w:p>
@@ -4062,25 +4124,43 @@
           <w:sz w:val="22"/>
           <w:szCs w:val="22"/>
         </w:rPr>
-        <w:t xml:space="preserve">The structural prerequisite that distinguishes the present model from a purely classical kinetic system is the hyperfine tensor anisotropy: removing it removes the response, regardless of the rate ratios or noise channels. This places hyperfine structure (more precisely, the </w:t>
-      </w:r>
-      <w:r>
-        <w:rPr>
-          <w:rFonts w:ascii="Times New Roman" w:cs="Times New Roman" w:eastAsia="Times New Roman" w:hAnsi="Times New Roman"/>
-          <w:i/>
-          <w:iCs/>
-          <w:sz w:val="22"/>
-          <w:szCs w:val="22"/>
-        </w:rPr>
-        <w:t xml:space="preserve">axial</w:t>
-      </w:r>
-      <w:r>
-        <w:rPr>
-          <w:rFonts w:ascii="Times New Roman" w:cs="Times New Roman" w:eastAsia="Times New Roman" w:hAnsi="Times New Roman"/>
-          <w:sz w:val="22"/>
-          <w:szCs w:val="22"/>
-        </w:rPr>
-        <w:t xml:space="preserve"> component of it) as a necessary structural ingredient in the tested implementation.</w:t>
+        <w:t xml:space="preserve">Within the present spin-dynamical model, hyperfine tensor anisotropy is the structural ingredient that produces orientation dependence: setting </w:t>
+      </w:r>
+      <w:r>
+        <w:rPr>
+          <w:rFonts w:ascii="Times New Roman" w:cs="Times New Roman" w:eastAsia="Times New Roman" w:hAnsi="Times New Roman"/>
+          <w:i/>
+          <w:iCs/>
+          <w:sz w:val="22"/>
+          <w:szCs w:val="22"/>
+        </w:rPr>
+        <w:t xml:space="preserve">A</w:t>
+      </w:r>
+      <w:r>
+        <w:rPr>
+          <w:rFonts w:ascii="Times New Roman" w:cs="Times New Roman" w:eastAsia="Times New Roman" w:hAnsi="Times New Roman"/>
+          <w:sz w:val="22"/>
+          <w:szCs w:val="22"/>
+        </w:rPr>
+        <w:t xml:space="preserve">∥ = </w:t>
+      </w:r>
+      <w:r>
+        <w:rPr>
+          <w:rFonts w:ascii="Times New Roman" w:cs="Times New Roman" w:eastAsia="Times New Roman" w:hAnsi="Times New Roman"/>
+          <w:i/>
+          <w:iCs/>
+          <w:sz w:val="22"/>
+          <w:szCs w:val="22"/>
+        </w:rPr>
+        <w:t xml:space="preserve">A</w:t>
+      </w:r>
+      <w:r>
+        <w:rPr>
+          <w:rFonts w:ascii="Times New Roman" w:cs="Times New Roman" w:eastAsia="Times New Roman" w:hAnsi="Times New Roman"/>
+          <w:sz w:val="22"/>
+          <w:szCs w:val="22"/>
+        </w:rPr>
+        <w:t xml:space="preserve">⊥ removes the response at numerical precision, regardless of the rate ratios or noise channels. The axial component of the hyperfine tensor is therefore identified as a necessary structural ingredient in the tested implementation.</w:t>
       </w:r>
     </w:p>
     <w:p>
@@ -5009,7 +5089,7 @@
           <w:sz w:val="20"/>
           <w:szCs w:val="20"/>
         </w:rPr>
-        <w:t xml:space="preserve">13. Denton AJ, Tiersch M, Kattnig DR, Hiscock HG, Sowa JK, Worster S, et al. Magnetosensitivity of tightly bound radical pairs in cryptochrome is enabled by the quantum Zeno effect. </w:t>
+        <w:t xml:space="preserve">13. Denton MCJ, Smith LD, Xu W, Pugsley J, Toghill A, Kattnig DR. Magnetosensitivity of tightly bound radical pairs in cryptochrome is enabled by the quantum Zeno effect. </w:t>
       </w:r>
       <w:r>
         <w:rPr>

</xml_diff>